<commit_message>
Correctif page garde + ajout deuxiéme bloc
</commit_message>
<xml_diff>
--- a/Rendu/Bloc1/bloc 1 Elaborer la stratégie du système d'information.docx
+++ b/Rendu/Bloc1/bloc 1 Elaborer la stratégie du système d'information.docx
@@ -100,12 +100,12 @@
     </w:p>
     <w:p>
       <w:r>
-        <w:t>👨‍🎓 Candidat : Luc Garrabos</w:t>
-      </w:r>
-    </w:p>
-    <w:p>
-      <w:r>
-        <w:t xml:space="preserve">📅 Année académique : 2024 </w:t>
+        <w:t>Candidat : Luc Garrabos</w:t>
+      </w:r>
+    </w:p>
+    <w:p>
+      <w:r>
+        <w:t xml:space="preserve">Année académique : 2024 </w:t>
       </w:r>
       <w:r>
         <w:t>-</w:t>
@@ -118,20 +118,24 @@
       <w:r>
         <w:br/>
       </w:r>
+    </w:p>
+    <w:p/>
+    <w:p/>
+    <w:p>
+      <w:pPr>
+        <w:jc w:val="center"/>
+      </w:pPr>
     </w:p>
     <w:p/>
     <w:p/>
     <w:p/>
     <w:p/>
-    <w:p/>
-    <w:p/>
-    <w:p/>
     <w:p>
       <w:pPr>
         <w:jc w:val="center"/>
       </w:pPr>
       <w:r>
-        <w:t>📍 Mention : Ce document constitue le livrable du Bloc 1 du projet de fin d’étude et répond aux compétences définies par le référentiel RNCP39582.</w:t>
+        <w:t>Mention : Ce document constitue le livrable du Bloc 1 du projet de fin d’étude et répond aux compétences définies par le référentiel RNCP39582.</w:t>
       </w:r>
     </w:p>
     <w:sdt>
@@ -2792,7 +2796,15 @@
     </w:p>
     <w:p>
       <w:r>
-        <w:t>Au regard des éléments analysés, le projet de transformation du système d’information de Logistique et CIE est techniquement et organisationnellement faisable, à condition de respecter certaines exigences clés :</w:t>
+        <w:t xml:space="preserve">Au regard des éléments analysés, le projet de transformation du système d’information de Logistique et CIE est techniquement et </w:t>
+      </w:r>
+      <w:proofErr w:type="spellStart"/>
+      <w:r>
+        <w:t>organisationnellement</w:t>
+      </w:r>
+      <w:proofErr w:type="spellEnd"/>
+      <w:r>
+        <w:t xml:space="preserve"> faisable, à condition de respecter certaines exigences clés :</w:t>
       </w:r>
     </w:p>
     <w:p>
@@ -3321,10 +3333,34 @@
         <w:spacing w:after="160" w:line="259" w:lineRule="auto"/>
       </w:pPr>
       <w:r>
-        <w:t>-Recours à des solutions open source éprouvées (Proxmox,</w:t>
-      </w:r>
-      <w:r>
-        <w:t xml:space="preserve"> pfsens, netdata etc…</w:t>
+        <w:t>-Recours à des solutions open source éprouvées (</w:t>
+      </w:r>
+      <w:proofErr w:type="spellStart"/>
+      <w:r>
+        <w:t>Proxmox</w:t>
+      </w:r>
+      <w:proofErr w:type="spellEnd"/>
+      <w:r>
+        <w:t>,</w:t>
+      </w:r>
+      <w:r>
+        <w:t xml:space="preserve"> </w:t>
+      </w:r>
+      <w:proofErr w:type="spellStart"/>
+      <w:r>
+        <w:t>pfsens</w:t>
+      </w:r>
+      <w:proofErr w:type="spellEnd"/>
+      <w:r>
+        <w:t xml:space="preserve">, </w:t>
+      </w:r>
+      <w:proofErr w:type="spellStart"/>
+      <w:r>
+        <w:t>netdata</w:t>
+      </w:r>
+      <w:proofErr w:type="spellEnd"/>
+      <w:r>
+        <w:t xml:space="preserve"> etc…</w:t>
       </w:r>
       <w:r>
         <w:t>).</w:t>
@@ -3564,7 +3600,15 @@
         <w:t>T</w:t>
       </w:r>
       <w:r>
-        <w:t>ests de sécurité annuels (pentests, audits).</w:t>
+        <w:t>ests de sécurité annuels (</w:t>
+      </w:r>
+      <w:proofErr w:type="spellStart"/>
+      <w:r>
+        <w:t>pentests</w:t>
+      </w:r>
+      <w:proofErr w:type="spellEnd"/>
+      <w:r>
+        <w:t>, audits).</w:t>
       </w:r>
     </w:p>
     <w:p>
@@ -4484,7 +4528,15 @@
         <w:t>Infrastructure</w:t>
       </w:r>
       <w:r>
-        <w:t xml:space="preserve"> : acquisition de 3 serveurs physiques compatibles virtualisation (Proxmox ou équivalent), </w:t>
+        <w:t xml:space="preserve"> : acquisition de 3 serveurs physiques compatibles virtualisation (</w:t>
+      </w:r>
+      <w:proofErr w:type="spellStart"/>
+      <w:r>
+        <w:t>Proxmox</w:t>
+      </w:r>
+      <w:proofErr w:type="spellEnd"/>
+      <w:r>
+        <w:t xml:space="preserve"> ou équivalent), </w:t>
       </w:r>
       <w:r>
         <w:t xml:space="preserve">et 2 serveurs de </w:t>
@@ -4832,7 +4884,15 @@
           </w:tcPr>
           <w:p>
             <w:r>
-              <w:t>Solution de sauvegarde immuable (on-premise)</w:t>
+              <w:t>Solution de sauvegarde immuable (on-</w:t>
+            </w:r>
+            <w:proofErr w:type="spellStart"/>
+            <w:r>
+              <w:t>premise</w:t>
+            </w:r>
+            <w:proofErr w:type="spellEnd"/>
+            <w:r>
+              <w:t>)</w:t>
             </w:r>
           </w:p>
         </w:tc>
@@ -5832,7 +5892,15 @@
         <w:t>Tableaux de suivi</w:t>
       </w:r>
       <w:r>
-        <w:t xml:space="preserve"> : reporting mensuel au comité stratégique SI.</w:t>
+        <w:t xml:space="preserve"> : </w:t>
+      </w:r>
+      <w:proofErr w:type="spellStart"/>
+      <w:r>
+        <w:t>reporting</w:t>
+      </w:r>
+      <w:proofErr w:type="spellEnd"/>
+      <w:r>
+        <w:t xml:space="preserve"> mensuel au comité stratégique SI.</w:t>
       </w:r>
     </w:p>
     <w:p>
@@ -11340,6 +11408,7 @@
   <w:style w:type="character" w:default="1" w:styleId="Policepardfaut">
     <w:name w:val="Default Paragraph Font"/>
     <w:uiPriority w:val="1"/>
+    <w:semiHidden/>
     <w:unhideWhenUsed/>
   </w:style>
   <w:style w:type="table" w:default="1" w:styleId="TableauNormal">
@@ -12075,27 +12144,10 @@
 </file>
 
 <file path=customXml/item1.xml><?xml version="1.0" encoding="utf-8"?>
-<?mso-contentType ?>
-<FormTemplates xmlns="http://schemas.microsoft.com/sharepoint/v3/contenttype/forms">
-  <Display>DocumentLibraryForm</Display>
-  <Edit>DocumentLibraryForm</Edit>
-  <New>DocumentLibraryForm</New>
-</FormTemplates>
+<b:Sources xmlns:b="http://schemas.openxmlformats.org/officeDocument/2006/bibliography" xmlns="http://schemas.openxmlformats.org/officeDocument/2006/bibliography" SelectedStyle="\APASixthEditionOfficeOnline.xsl" StyleName="APA" Version="6"/>
 </file>
 
 <file path=customXml/item2.xml><?xml version="1.0" encoding="utf-8"?>
-<p:properties xmlns:p="http://schemas.microsoft.com/office/2006/metadata/properties" xmlns:xsi="http://www.w3.org/2001/XMLSchema-instance" xmlns:pc="http://schemas.microsoft.com/office/infopath/2007/PartnerControls">
-  <documentManagement>
-    <_activity xmlns="5b83e578-d17d-42c1-bbfa-82168b29df75" xsi:nil="true"/>
-  </documentManagement>
-</p:properties>
-</file>
-
-<file path=customXml/item3.xml><?xml version="1.0" encoding="utf-8"?>
-<b:Sources xmlns:b="http://schemas.openxmlformats.org/officeDocument/2006/bibliography" xmlns="http://schemas.openxmlformats.org/officeDocument/2006/bibliography" SelectedStyle="\APASixthEditionOfficeOnline.xsl" StyleName="APA" Version="6"/>
-</file>
-
-<file path=customXml/item4.xml><?xml version="1.0" encoding="utf-8"?>
 <ct:contentTypeSchema xmlns:ct="http://schemas.microsoft.com/office/2006/metadata/contentType" xmlns:ma="http://schemas.microsoft.com/office/2006/metadata/properties/metaAttributes" ct:_="" ma:_="" ma:contentTypeName="Document" ma:contentTypeID="0x01010006B834183EDB914BB08954C8DD43EAB8" ma:contentTypeVersion="12" ma:contentTypeDescription="Crée un document." ma:contentTypeScope="" ma:versionID="d6da123db1e3b9d0aedb8f2b3b13d29c">
   <xsd:schema xmlns:xsd="http://www.w3.org/2001/XMLSchema" xmlns:xs="http://www.w3.org/2001/XMLSchema" xmlns:p="http://schemas.microsoft.com/office/2006/metadata/properties" xmlns:ns3="5b83e578-d17d-42c1-bbfa-82168b29df75" xmlns:ns4="fe5b55c2-e991-4fa2-9462-3c96ad29ee96" targetNamespace="http://schemas.microsoft.com/office/2006/metadata/properties" ma:root="true" ma:fieldsID="f2f8a7fb4b8a9007b5869de2030b1185" ns3:_="" ns4:_="">
     <xsd:import namespace="5b83e578-d17d-42c1-bbfa-82168b29df75"/>
@@ -12310,25 +12362,24 @@
 </ct:contentTypeSchema>
 </file>
 
-<file path=customXml/itemProps1.xml><?xml version="1.0" encoding="utf-8"?>
-<ds:datastoreItem xmlns:ds="http://schemas.openxmlformats.org/officeDocument/2006/customXml" ds:itemID="{834741B4-581F-4A31-84F4-B955FF5AEE9F}">
-  <ds:schemaRefs>
-    <ds:schemaRef ds:uri="http://schemas.microsoft.com/sharepoint/v3/contenttype/forms"/>
-  </ds:schemaRefs>
-</ds:datastoreItem>
+<file path=customXml/item3.xml><?xml version="1.0" encoding="utf-8"?>
+<?mso-contentType ?>
+<FormTemplates xmlns="http://schemas.microsoft.com/sharepoint/v3/contenttype/forms">
+  <Display>DocumentLibraryForm</Display>
+  <Edit>DocumentLibraryForm</Edit>
+  <New>DocumentLibraryForm</New>
+</FormTemplates>
 </file>
 
-<file path=customXml/itemProps2.xml><?xml version="1.0" encoding="utf-8"?>
-<ds:datastoreItem xmlns:ds="http://schemas.openxmlformats.org/officeDocument/2006/customXml" ds:itemID="{8E0E0CA7-E4D8-4796-A1D8-AC02448CB5EB}">
-  <ds:schemaRefs>
-    <ds:schemaRef ds:uri="http://schemas.microsoft.com/office/2006/metadata/properties"/>
-    <ds:schemaRef ds:uri="http://schemas.microsoft.com/office/infopath/2007/PartnerControls"/>
-    <ds:schemaRef ds:uri="5b83e578-d17d-42c1-bbfa-82168b29df75"/>
-  </ds:schemaRefs>
-</ds:datastoreItem>
+<file path=customXml/item4.xml><?xml version="1.0" encoding="utf-8"?>
+<p:properties xmlns:p="http://schemas.microsoft.com/office/2006/metadata/properties" xmlns:xsi="http://www.w3.org/2001/XMLSchema-instance" xmlns:pc="http://schemas.microsoft.com/office/infopath/2007/PartnerControls">
+  <documentManagement>
+    <_activity xmlns="5b83e578-d17d-42c1-bbfa-82168b29df75" xsi:nil="true"/>
+  </documentManagement>
+</p:properties>
 </file>
 
-<file path=customXml/itemProps3.xml><?xml version="1.0" encoding="utf-8"?>
+<file path=customXml/itemProps1.xml><?xml version="1.0" encoding="utf-8"?>
 <ds:datastoreItem xmlns:ds="http://schemas.openxmlformats.org/officeDocument/2006/customXml" ds:itemID="{76026148-B3B7-41CB-BA68-D15BFB8014B7}">
   <ds:schemaRefs>
     <ds:schemaRef ds:uri="http://schemas.openxmlformats.org/officeDocument/2006/bibliography"/>
@@ -12336,7 +12387,7 @@
 </ds:datastoreItem>
 </file>
 
-<file path=customXml/itemProps4.xml><?xml version="1.0" encoding="utf-8"?>
+<file path=customXml/itemProps2.xml><?xml version="1.0" encoding="utf-8"?>
 <ds:datastoreItem xmlns:ds="http://schemas.openxmlformats.org/officeDocument/2006/customXml" ds:itemID="{98AE95D1-CB13-48C6-BD0F-CFA4A79C8882}">
   <ds:schemaRefs>
     <ds:schemaRef ds:uri="http://schemas.microsoft.com/office/2006/metadata/contentType"/>
@@ -12353,4 +12404,22 @@
     <ds:schemaRef ds:uri="http://schemas.microsoft.com/internal/obd"/>
   </ds:schemaRefs>
 </ds:datastoreItem>
+</file>
+
+<file path=customXml/itemProps3.xml><?xml version="1.0" encoding="utf-8"?>
+<ds:datastoreItem xmlns:ds="http://schemas.openxmlformats.org/officeDocument/2006/customXml" ds:itemID="{834741B4-581F-4A31-84F4-B955FF5AEE9F}">
+  <ds:schemaRefs>
+    <ds:schemaRef ds:uri="http://schemas.microsoft.com/sharepoint/v3/contenttype/forms"/>
+  </ds:schemaRefs>
+</ds:datastoreItem>
+</file>
+
+<file path=customXml/itemProps4.xml><?xml version="1.0" encoding="utf-8"?>
+<ds:datastoreItem xmlns:ds="http://schemas.openxmlformats.org/officeDocument/2006/customXml" ds:itemID="{8E0E0CA7-E4D8-4796-A1D8-AC02448CB5EB}">
+  <ds:schemaRefs>
+    <ds:schemaRef ds:uri="http://schemas.microsoft.com/office/2006/metadata/properties"/>
+    <ds:schemaRef ds:uri="http://schemas.microsoft.com/office/infopath/2007/PartnerControls"/>
+    <ds:schemaRef ds:uri="5b83e578-d17d-42c1-bbfa-82168b29df75"/>
+  </ds:schemaRefs>
+</ds:datastoreItem>
 </file>
</xml_diff>

<commit_message>
Correctif bloc 1 + update bloc 2
</commit_message>
<xml_diff>
--- a/Rendu/Bloc1/bloc 1 Elaborer la stratégie du système d'information.docx
+++ b/Rendu/Bloc1/bloc 1 Elaborer la stratégie du système d'information.docx
@@ -5318,13 +5318,27 @@
         <w:t>Impact direct sur la qualité de</w:t>
       </w:r>
       <w:r>
-        <w:t xml:space="preserve"> services (pertes de suivis des colis,..)</w:t>
-      </w:r>
-    </w:p>
-    <w:p>
-      <w:pPr>
-        <w:spacing w:after="160" w:line="259" w:lineRule="auto"/>
-      </w:pPr>
+        <w:t xml:space="preserve"> services (pertes de suivis des </w:t>
+      </w:r>
+      <w:r>
+        <w:t>colis...</w:t>
+      </w:r>
+      <w:r>
+        <w:t>)</w:t>
+      </w:r>
+    </w:p>
+    <w:p>
+      <w:pPr>
+        <w:spacing w:after="160" w:line="259" w:lineRule="auto"/>
+      </w:pPr>
+    </w:p>
+    <w:p>
+      <w:pPr>
+        <w:spacing w:after="160" w:line="259" w:lineRule="auto"/>
+      </w:pPr>
+      <w:r>
+        <w:t>Ce projet s’inscrit sur une durée assez longue, le remplacement de l’infrastructure se feras progressivement puisque l’équipe IT mobilisée doit travailler en même temps sur ses tâches courantes. L’objectif serait que la nouvelle infrastructure soit pleinement opérationnel d’ici 1 ans à partir du moment où le cahier des charges et le budget et validée.</w:t>
+      </w:r>
     </w:p>
     <w:p>
       <w:pPr>

</xml_diff>

<commit_message>
update du bloc 2
</commit_message>
<xml_diff>
--- a/Rendu/Bloc1/bloc 1 Elaborer la stratégie du système d'information.docx
+++ b/Rendu/Bloc1/bloc 1 Elaborer la stratégie du système d'information.docx
@@ -5099,9 +5099,6 @@
       </w:r>
     </w:p>
     <w:p/>
-    <w:p/>
-    <w:p/>
-    <w:p/>
     <w:p>
       <w:pPr>
         <w:pStyle w:val="Titre2"/>
@@ -5173,7 +5170,6 @@
         <w:spacing w:after="160" w:line="259" w:lineRule="auto"/>
       </w:pPr>
       <w:r>
-        <w:lastRenderedPageBreak/>
         <w:t>Protection contre les pertes financières dues à une cyberattaque ou panne majeure.</w:t>
       </w:r>
     </w:p>
@@ -5253,6 +5249,7 @@
         <w:spacing w:after="160" w:line="259" w:lineRule="auto"/>
       </w:pPr>
       <w:r>
+        <w:lastRenderedPageBreak/>
         <w:t>Sanctions légales et financières (RGPD, CNIL).</w:t>
       </w:r>
     </w:p>
@@ -5353,7 +5350,7 @@
     </w:p>
     <w:p>
       <w:r>
-        <w:t>L’infrastructure cible s’appuie sur une architecture virtualisée et redondée, intégrant des mécanismes de sauvegardes immuables et de réplication vers un cloud externe. Cette conception garantit la disponibilité des services et s’inscrit pleinement dans le dispositif de PRA/PCA défini précédemment.</w:t>
+        <w:t>L’infrastructure cible s’appuie sur une architecture virtualisée et redondée, intégrant des mécanismes de sauvegardes. Cette conception garantit la disponibilité des services et s’inscrit pleinement dans le dispositif de PRA/PCA défini précédemment.</w:t>
       </w:r>
     </w:p>
     <w:p>
@@ -12094,6 +12091,27 @@
 </file>
 
 <file path=customXml/item1.xml><?xml version="1.0" encoding="utf-8"?>
+<?mso-contentType ?>
+<FormTemplates xmlns="http://schemas.microsoft.com/sharepoint/v3/contenttype/forms">
+  <Display>DocumentLibraryForm</Display>
+  <Edit>DocumentLibraryForm</Edit>
+  <New>DocumentLibraryForm</New>
+</FormTemplates>
+</file>
+
+<file path=customXml/item2.xml><?xml version="1.0" encoding="utf-8"?>
+<p:properties xmlns:p="http://schemas.microsoft.com/office/2006/metadata/properties" xmlns:xsi="http://www.w3.org/2001/XMLSchema-instance" xmlns:pc="http://schemas.microsoft.com/office/infopath/2007/PartnerControls">
+  <documentManagement>
+    <_activity xmlns="5b83e578-d17d-42c1-bbfa-82168b29df75" xsi:nil="true"/>
+  </documentManagement>
+</p:properties>
+</file>
+
+<file path=customXml/item3.xml><?xml version="1.0" encoding="utf-8"?>
+<b:Sources xmlns:b="http://schemas.openxmlformats.org/officeDocument/2006/bibliography" xmlns="http://schemas.openxmlformats.org/officeDocument/2006/bibliography" SelectedStyle="\APASixthEditionOfficeOnline.xsl" StyleName="APA" Version="6"/>
+</file>
+
+<file path=customXml/item4.xml><?xml version="1.0" encoding="utf-8"?>
 <ct:contentTypeSchema xmlns:ct="http://schemas.microsoft.com/office/2006/metadata/contentType" xmlns:ma="http://schemas.microsoft.com/office/2006/metadata/properties/metaAttributes" ct:_="" ma:_="" ma:contentTypeName="Document" ma:contentTypeID="0x01010006B834183EDB914BB08954C8DD43EAB8" ma:contentTypeVersion="12" ma:contentTypeDescription="Crée un document." ma:contentTypeScope="" ma:versionID="d6da123db1e3b9d0aedb8f2b3b13d29c">
   <xsd:schema xmlns:xsd="http://www.w3.org/2001/XMLSchema" xmlns:xs="http://www.w3.org/2001/XMLSchema" xmlns:p="http://schemas.microsoft.com/office/2006/metadata/properties" xmlns:ns3="5b83e578-d17d-42c1-bbfa-82168b29df75" xmlns:ns4="fe5b55c2-e991-4fa2-9462-3c96ad29ee96" targetNamespace="http://schemas.microsoft.com/office/2006/metadata/properties" ma:root="true" ma:fieldsID="f2f8a7fb4b8a9007b5869de2030b1185" ns3:_="" ns4:_="">
     <xsd:import namespace="5b83e578-d17d-42c1-bbfa-82168b29df75"/>
@@ -12308,28 +12326,33 @@
 </ct:contentTypeSchema>
 </file>
 
-<file path=customXml/item2.xml><?xml version="1.0" encoding="utf-8"?>
-<b:Sources xmlns:b="http://schemas.openxmlformats.org/officeDocument/2006/bibliography" xmlns="http://schemas.openxmlformats.org/officeDocument/2006/bibliography" SelectedStyle="\APASixthEditionOfficeOnline.xsl" StyleName="APA" Version="6"/>
+<file path=customXml/itemProps1.xml><?xml version="1.0" encoding="utf-8"?>
+<ds:datastoreItem xmlns:ds="http://schemas.openxmlformats.org/officeDocument/2006/customXml" ds:itemID="{834741B4-581F-4A31-84F4-B955FF5AEE9F}">
+  <ds:schemaRefs>
+    <ds:schemaRef ds:uri="http://schemas.microsoft.com/sharepoint/v3/contenttype/forms"/>
+  </ds:schemaRefs>
+</ds:datastoreItem>
 </file>
 
-<file path=customXml/item3.xml><?xml version="1.0" encoding="utf-8"?>
-<p:properties xmlns:p="http://schemas.microsoft.com/office/2006/metadata/properties" xmlns:xsi="http://www.w3.org/2001/XMLSchema-instance" xmlns:pc="http://schemas.microsoft.com/office/infopath/2007/PartnerControls">
-  <documentManagement>
-    <_activity xmlns="5b83e578-d17d-42c1-bbfa-82168b29df75" xsi:nil="true"/>
-  </documentManagement>
-</p:properties>
+<file path=customXml/itemProps2.xml><?xml version="1.0" encoding="utf-8"?>
+<ds:datastoreItem xmlns:ds="http://schemas.openxmlformats.org/officeDocument/2006/customXml" ds:itemID="{8E0E0CA7-E4D8-4796-A1D8-AC02448CB5EB}">
+  <ds:schemaRefs>
+    <ds:schemaRef ds:uri="http://schemas.microsoft.com/office/2006/metadata/properties"/>
+    <ds:schemaRef ds:uri="http://schemas.microsoft.com/office/infopath/2007/PartnerControls"/>
+    <ds:schemaRef ds:uri="5b83e578-d17d-42c1-bbfa-82168b29df75"/>
+  </ds:schemaRefs>
+</ds:datastoreItem>
 </file>
 
-<file path=customXml/item4.xml><?xml version="1.0" encoding="utf-8"?>
-<?mso-contentType ?>
-<FormTemplates xmlns="http://schemas.microsoft.com/sharepoint/v3/contenttype/forms">
-  <Display>DocumentLibraryForm</Display>
-  <Edit>DocumentLibraryForm</Edit>
-  <New>DocumentLibraryForm</New>
-</FormTemplates>
+<file path=customXml/itemProps3.xml><?xml version="1.0" encoding="utf-8"?>
+<ds:datastoreItem xmlns:ds="http://schemas.openxmlformats.org/officeDocument/2006/customXml" ds:itemID="{76026148-B3B7-41CB-BA68-D15BFB8014B7}">
+  <ds:schemaRefs>
+    <ds:schemaRef ds:uri="http://schemas.openxmlformats.org/officeDocument/2006/bibliography"/>
+  </ds:schemaRefs>
+</ds:datastoreItem>
 </file>
 
-<file path=customXml/itemProps1.xml><?xml version="1.0" encoding="utf-8"?>
+<file path=customXml/itemProps4.xml><?xml version="1.0" encoding="utf-8"?>
 <ds:datastoreItem xmlns:ds="http://schemas.openxmlformats.org/officeDocument/2006/customXml" ds:itemID="{98AE95D1-CB13-48C6-BD0F-CFA4A79C8882}">
   <ds:schemaRefs>
     <ds:schemaRef ds:uri="http://schemas.microsoft.com/office/2006/metadata/contentType"/>
@@ -12346,30 +12369,4 @@
     <ds:schemaRef ds:uri="http://schemas.microsoft.com/internal/obd"/>
   </ds:schemaRefs>
 </ds:datastoreItem>
-</file>
-
-<file path=customXml/itemProps2.xml><?xml version="1.0" encoding="utf-8"?>
-<ds:datastoreItem xmlns:ds="http://schemas.openxmlformats.org/officeDocument/2006/customXml" ds:itemID="{76026148-B3B7-41CB-BA68-D15BFB8014B7}">
-  <ds:schemaRefs>
-    <ds:schemaRef ds:uri="http://schemas.openxmlformats.org/officeDocument/2006/bibliography"/>
-  </ds:schemaRefs>
-</ds:datastoreItem>
-</file>
-
-<file path=customXml/itemProps3.xml><?xml version="1.0" encoding="utf-8"?>
-<ds:datastoreItem xmlns:ds="http://schemas.openxmlformats.org/officeDocument/2006/customXml" ds:itemID="{8E0E0CA7-E4D8-4796-A1D8-AC02448CB5EB}">
-  <ds:schemaRefs>
-    <ds:schemaRef ds:uri="http://schemas.microsoft.com/office/2006/metadata/properties"/>
-    <ds:schemaRef ds:uri="http://schemas.microsoft.com/office/infopath/2007/PartnerControls"/>
-    <ds:schemaRef ds:uri="5b83e578-d17d-42c1-bbfa-82168b29df75"/>
-  </ds:schemaRefs>
-</ds:datastoreItem>
-</file>
-
-<file path=customXml/itemProps4.xml><?xml version="1.0" encoding="utf-8"?>
-<ds:datastoreItem xmlns:ds="http://schemas.openxmlformats.org/officeDocument/2006/customXml" ds:itemID="{834741B4-581F-4A31-84F4-B955FF5AEE9F}">
-  <ds:schemaRefs>
-    <ds:schemaRef ds:uri="http://schemas.microsoft.com/sharepoint/v3/contenttype/forms"/>
-  </ds:schemaRefs>
-</ds:datastoreItem>
 </file>
</xml_diff>